<commit_message>
docs: update defense report scope and workbook conclusions
</commit_message>
<xml_diff>
--- a/docs/青韵智控_答辩基础报告_20261009.docx
+++ b/docs/青韵智控_答辩基础报告_20261009.docx
@@ -22,6 +22,11 @@
     </w:p>
     <w:p>
       <w:r>
+        <w:t>报告版本：表格结果版（第二次更新）</w:t>
+      </w:r>
+    </w:p>
+    <w:p>
+      <w:r>
         <w:t>用途：答辩准备、成果口径统一、证据备查和团队分工讨论</w:t>
       </w:r>
     </w:p>
@@ -39,6 +44,9 @@
       </w:r>
     </w:p>
     <w:p>
+      <w:pPr>
+        <w:keepNext/>
+      </w:pPr>
       <w:r/>
       <w:r>
         <w:rPr>
@@ -470,7 +478,19 @@
         <w:t>Git状态。</w:t>
       </w:r>
       <w:r>
-        <w:t xml:space="preserve"> 编制基线main与origin/main均为b0c615d。研发路线和首次答辩冻结已在主分支，本次新增数据表及v2冻结。远程特征工程、分批次模型和影子建议分支未纳入当前main，不计为稳定答辩版已交付功能。</w:t>
+        <w:t xml:space="preserve"> 本次核对的项目基线main与origin/main均为3d07a06，数据结果.xlsx及DEFENSE-20261009-v2冻结资料已提交GitHub。远程特征工程、分批次模型和影子建议分支未纳入当前main，不计为稳定答辩版已交付功能。后续报告提交产生的新提交号仅表示文档更新，不改变本报告引用的工程基线。</w:t>
+      </w:r>
+    </w:p>
+    <w:p>
+      <w:r/>
+      <w:r>
+        <w:rPr>
+          <w:b/>
+        </w:rPr>
+        <w:t>项目范围。</w:t>
+      </w:r>
+      <w:r>
+        <w:t xml:space="preserve"> 本地实机联调、接线指引及相关临时记录已移出项目目录，单独保存为个人本地资料，不提交GitHub，也不列为本项目成果或答辩证据。项目保留采集固件、软件平台与设计资料；硬件测试结论只以已归档的《数据结果.xlsx》为依据。软件本机复验用于说明演示环境准备情况，不作为硬件测试结论。</w:t>
       </w:r>
     </w:p>
     <w:p>
@@ -724,7 +744,7 @@
               <w:rPr>
                 <w:sz w:val="20"/>
               </w:rPr>
-              <w:t>三路TGS模拟通道和独立BME688接口设计</w:t>
+              <w:t>表格有TGS2600、TGS2602、TGS2603及BME688四通道响应、重复性和漂移结果</w:t>
             </w:r>
           </w:p>
         </w:tc>
@@ -747,7 +767,7 @@
               <w:rPr>
                 <w:sz w:val="20"/>
               </w:rPr>
-              <w:t>表格已明确四通道；预热、湿度补偿与更多工况</w:t>
+              <w:t>湿度补偿、跨样品区分能力与更多工况</w:t>
             </w:r>
           </w:p>
         </w:tc>
@@ -798,7 +818,7 @@
               <w:rPr>
                 <w:sz w:val="20"/>
               </w:rPr>
-              <w:t>固件接口及主稿标定报告值</w:t>
+              <w:t>表格有500—5000 g、10点各5次的静态标定结果</w:t>
             </w:r>
           </w:p>
         </w:tc>
@@ -821,7 +841,7 @@
               <w:rPr>
                 <w:sz w:val="20"/>
               </w:rPr>
-              <w:t>表格重复加载值已挂接；持久化与长期漂移</w:t>
+              <w:t>标定持久化、长期漂移与动态工况</w:t>
             </w:r>
           </w:p>
         </w:tc>
@@ -1505,6 +1525,18 @@
         <w:rPr>
           <w:b/>
         </w:rPr>
+        <w:t>这些结果支持的结论。</w:t>
+      </w:r>
+      <w:r>
+        <w:t xml:space="preserve"> 在表格列出的试验条件下，四个气敏通道有可量化的响应与重复性记录，双测点空气温湿度有参考偏差结果，称重有静态标定结果，连续记录和静置联合采集有完整率结果。这些指标构成感知与记录原型的工程基础；它们没有给出茶叶状态识别准确率、完整做青控制效果或成茶品质增益。答辩应围绕已有工程结果展开，再说明后续工艺验证路线。</w:t>
+      </w:r>
+    </w:p>
+    <w:p>
+      <w:r/>
+      <w:r>
+        <w:rPr>
+          <w:b/>
+        </w:rPr>
         <w:t>软件历史记录与当前环境结果。</w:t>
       </w:r>
       <w:r>
@@ -2146,6 +2178,9 @@
       </w:r>
     </w:p>
     <w:p>
+      <w:pPr>
+        <w:keepNext/>
+      </w:pPr>
       <w:r/>
       <w:r>
         <w:rPr>
@@ -2386,7 +2421,7 @@
               <w:rPr>
                 <w:sz w:val="20"/>
               </w:rPr>
-              <w:t>实际模态、气敏工程问题、历史重复性指标</w:t>
+              <w:t>四个气敏通道、重复性与标定、长时采集指标</w:t>
             </w:r>
           </w:p>
         </w:tc>
@@ -2409,7 +2444,7 @@
               <w:rPr>
                 <w:sz w:val="20"/>
               </w:rPr>
-              <w:t>表格处理结果与软件接口分开</w:t>
+              <w:t>指标按表格条件解释，不外推工艺效果</w:t>
             </w:r>
           </w:p>
         </w:tc>
@@ -2730,7 +2765,7 @@
         <w:t>演示安排。</w:t>
       </w:r>
       <w:r>
-        <w:t xml:space="preserve"> 硬件结果展示数据表的配置、测点、重复值及对应指标。软件界面采用明确标注的模拟模式，展示批次、事件和回放；模拟曲线与图片不作为茶样实验结果。当前缺少绘图库，报告导出应整改并演练后再纳入现场流程。准备表格截图及模拟软件录屏作为演示备份。</w:t>
+        <w:t xml:space="preserve"> 硬件结果展示数据表的配置、测点、重复值及对应指标，不调用隔离的本地实机资料。软件界面采用明确标注的模拟模式，展示批次、事件和回放；模拟曲线与图片不作为茶样实验结果。当前缺少绘图库，报告导出应整改并演练后再纳入现场流程。准备表格截图及模拟软件录屏作为演示备份。</w:t>
       </w:r>
     </w:p>
     <w:p>
@@ -2896,6 +2931,11 @@
     </w:p>
     <w:p>
       <w:r>
+        <w:t>表格备查顺序为：填写说明A4:H13核对配置；电子鼻_处理结果B5:P8及S8:S10核对通道与重复性；SHT31_处理结果A5:Q14及T5:T7核对组数与偏差；HX711_标定结果A5:K14及P5:P8核对重复值与拟合；整机稳定性A5:N14核对RUN10；联合采集汇总A5:P14核对120分钟记录与质量变化；申报材料摘要A3:E14核对摘要和使用标记。</w:t>
+      </w:r>
+    </w:p>
+    <w:p>
+      <w:r>
         <w:rPr>
           <w:sz w:val="18"/>
         </w:rPr>
@@ -2957,7 +2997,7 @@
     </w:p>
     <w:p>
       <w:r>
-        <w:t>本版报告按数据表更新。PPT本体尚未执行逐页替换；正式使用遵循表格标记及v2冻结说明，未开展新的真实做茶或执行器试验。</w:t>
+        <w:t>本版报告已按GitHub归档表格和v2冻结更新，并明确本地实机资料在项目范围之外。PPT本体尚未执行逐页替换；正式使用遵循表格标记及v2冻结说明，未开展新的真实做茶或执行器试验。</w:t>
       </w:r>
     </w:p>
     <w:sectPr>

</xml_diff>